<commit_message>
Put the quote-page late-fee sentences into the signed agreement files.
The Service and Cost-Plus documents a client signs still said 1.5% a month, and the prepped Working Agreement still said $50 a day.

Co-authored-by: Cursor <cursoragent@cursor.com>
</commit_message>
<xml_diff>
--- a/src/templates/CHS-Cost-Plus-Agreement-Template.docx
+++ b/src/templates/CHS-Cost-Plus-Agreement-Template.docx
@@ -945,7 +945,7 @@
           <w:sz w:val="20"/>
           <w:szCs w:val="20"/>
         </w:rPr>
-        <w:t xml:space="preserve">Contractor shall invoice Client on a bi-weekly basis (every two weeks) for all costs incurred plus the management fee during the billing period. Payment is due within 7 days of invoice date.</w:t>
+        <w:t xml:space="preserve">Contractor shall invoice Client on a bi-weekly basis (every two weeks) for all costs incurred plus the management fee during the billing period. The cycle is invoiced and due within twenty-four (24) hours. No late fee applies to Cost-Plus invoices. If an invoice is not paid by its due date, work will pause and will not continue until the invoice is paid in full.</w:t>
       </w:r>
     </w:p>
     <w:p>
@@ -1033,7 +1033,7 @@
           <w:sz w:val="20"/>
           <w:szCs w:val="20"/>
         </w:rPr>
-        <w:t xml:space="preserve">Credit Card Convenience Fee: A 3.5% convenience fee will be added to credit/debit card payments. No fee for check or ACH. Late payments are subject to 1.5% monthly late fee after 7 days past due.</w:t>
+        <w:t xml:space="preserve">Credit Card Convenience Fee: A 3.5% convenience fee will be added to credit/debit card payments. No fee for check or ACH. The Late Payment Fee in the Service Agreement does not apply to this Cost-Plus Billing Agreement.</w:t>
       </w:r>
     </w:p>
     <w:p>

</xml_diff>